<commit_message>
update add section in hallazgos document
</commit_message>
<xml_diff>
--- a/documentacion/Hallazgos.docx
+++ b/documentacion/Hallazgos.docx
@@ -1,18 +1,13 @@
 
 <file path=word/document.xml><?xml version="1.0" encoding="utf-8"?>
-<w:document xmlns:wpc="http://schemas.microsoft.com/office/word/2010/wordprocessingCanvas" xmlns:cx="http://schemas.microsoft.com/office/drawing/2014/chartex" xmlns:cx1="http://schemas.microsoft.com/office/drawing/2015/9/8/chartex" xmlns:cx2="http://schemas.microsoft.com/office/drawing/2015/10/21/chartex" xmlns:cx3="http://schemas.microsoft.com/office/drawing/2016/5/9/chartex" xmlns:cx4="http://schemas.microsoft.com/office/drawing/2016/5/10/chartex" xmlns:cx5="http://schemas.microsoft.com/office/drawing/2016/5/11/chartex" xmlns:cx6="http://schemas.microsoft.com/office/drawing/2016/5/12/chartex" xmlns:cx7="http://schemas.microsoft.com/office/drawing/2016/5/13/chartex" xmlns:cx8="http://schemas.microsoft.com/office/drawing/2016/5/14/chartex" xmlns:mc="http://schemas.openxmlformats.org/markup-compatibility/2006" xmlns:aink="http://schemas.microsoft.com/office/drawing/2016/ink" xmlns:am3d="http://schemas.microsoft.com/office/drawing/2017/model3d" xmlns:o="urn:schemas-microsoft-com:office:office" xmlns:oel="http://schemas.microsoft.com/office/2019/extlst" xmlns:r="http://schemas.openxmlformats.org/officeDocument/2006/relationships" xmlns:m="http://schemas.openxmlformats.org/officeDocument/2006/math" xmlns:v="urn:schemas-microsoft-com:vml" xmlns:wp14="http://schemas.microsoft.com/office/word/2010/wordprocessingDrawing" xmlns:wp="http://schemas.openxmlformats.org/drawingml/2006/wordprocessingDrawing" xmlns:w10="urn:schemas-microsoft-com:office:word" xmlns:w="http://schemas.openxmlformats.org/wordprocessingml/2006/main" xmlns:w14="http://schemas.microsoft.com/office/word/2010/wordml" xmlns:w15="http://schemas.microsoft.com/office/word/2012/wordml" xmlns:w16cex="http://schemas.microsoft.com/office/word/2018/wordml/cex" xmlns:w16cid="http://schemas.microsoft.com/office/word/2016/wordml/cid" xmlns:w16="http://schemas.microsoft.com/office/word/2018/wordml" xmlns:w16du="http://schemas.microsoft.com/office/word/2023/wordml/word16du" xmlns:w16sdtdh="http://schemas.microsoft.com/office/word/2020/wordml/sdtdatahash" xmlns:w16sdtfl="http://schemas.microsoft.com/office/word/2024/wordml/sdtformatlock" xmlns:w16se="http://schemas.microsoft.com/office/word/2015/wordml/symex" xmlns:wpg="http://schemas.microsoft.com/office/word/2010/wordprocessingGroup" xmlns:wpi="http://schemas.microsoft.com/office/word/2010/wordprocessingInk" xmlns:wne="http://schemas.microsoft.com/office/word/2006/wordml" xmlns:wps="http://schemas.microsoft.com/office/word/2010/wordprocessingShape" mc:Ignorable="w14 w15 w16se w16cid w16 w16cex w16sdtdh w16sdtfl w16du wp14">
+<w:document xmlns:wpc="http://schemas.microsoft.com/office/word/2010/wordprocessingCanvas" xmlns:cx="http://schemas.microsoft.com/office/drawing/2014/chartex" xmlns:cx1="http://schemas.microsoft.com/office/drawing/2015/9/8/chartex" xmlns:cx2="http://schemas.microsoft.com/office/drawing/2015/10/21/chartex" xmlns:cx3="http://schemas.microsoft.com/office/drawing/2016/5/9/chartex" xmlns:cx4="http://schemas.microsoft.com/office/drawing/2016/5/10/chartex" xmlns:cx5="http://schemas.microsoft.com/office/drawing/2016/5/11/chartex" xmlns:cx6="http://schemas.microsoft.com/office/drawing/2016/5/12/chartex" xmlns:cx7="http://schemas.microsoft.com/office/drawing/2016/5/13/chartex" xmlns:cx8="http://schemas.microsoft.com/office/drawing/2016/5/14/chartex" xmlns:mc="http://schemas.openxmlformats.org/markup-compatibility/2006" xmlns:aink="http://schemas.microsoft.com/office/drawing/2016/ink" xmlns:am3d="http://schemas.microsoft.com/office/drawing/2017/model3d" xmlns:o="urn:schemas-microsoft-com:office:office" xmlns:oel="http://schemas.microsoft.com/office/2019/extlst" xmlns:r="http://schemas.openxmlformats.org/officeDocument/2006/relationships" xmlns:m="http://schemas.openxmlformats.org/officeDocument/2006/math" xmlns:v="urn:schemas-microsoft-com:vml" xmlns:wp14="http://schemas.microsoft.com/office/word/2010/wordprocessingDrawing" xmlns:wp="http://schemas.openxmlformats.org/drawingml/2006/wordprocessingDrawing" xmlns:w10="urn:schemas-microsoft-com:office:word" xmlns:w="http://schemas.openxmlformats.org/wordprocessingml/2006/main" xmlns:w14="http://schemas.microsoft.com/office/word/2010/wordml" xmlns:w15="http://schemas.microsoft.com/office/word/2012/wordml" xmlns:w16cei="http://schemas.microsoft.com/office/word/2026/wordml/cei" xmlns:w16cex="http://schemas.microsoft.com/office/word/2018/wordml/cex" xmlns:w16cid="http://schemas.microsoft.com/office/word/2016/wordml/cid" xmlns:w16="http://schemas.microsoft.com/office/word/2018/wordml" xmlns:w16du="http://schemas.microsoft.com/office/word/2023/wordml/word16du" xmlns:w16sdtdh="http://schemas.microsoft.com/office/word/2020/wordml/sdtdatahash" xmlns:w16sdtfl="http://schemas.microsoft.com/office/word/2024/wordml/sdtformatlock" xmlns:w16se="http://schemas.microsoft.com/office/word/2015/wordml/symex" xmlns:wpg="http://schemas.microsoft.com/office/word/2010/wordprocessingGroup" xmlns:wpi="http://schemas.microsoft.com/office/word/2010/wordprocessingInk" xmlns:wne="http://schemas.microsoft.com/office/word/2006/wordml" xmlns:wps="http://schemas.microsoft.com/office/word/2010/wordprocessingShape" mc:Ignorable="w14 w15 w16se w16cid w16 w16cex w16sdtdh w16sdtfl w16du wp14">
   <w:body>
     <w:p>
       <w:pPr>
         <w:pStyle w:val="Ttulo1"/>
       </w:pPr>
-      <w:proofErr w:type="spellStart"/>
-      <w:r>
-        <w:t>TechLogistics</w:t>
-      </w:r>
-      <w:proofErr w:type="spellEnd"/>
-      <w:r>
-        <w:t xml:space="preserve"> S.A.S.</w:t>
+      <w:r>
+        <w:t>TechLogistics S.A.S.</w:t>
       </w:r>
     </w:p>
     <w:p>
@@ -88,13 +83,8 @@
         <w:pStyle w:val="Portada"/>
       </w:pPr>
       <w:r>
-        <w:t xml:space="preserve">Juan Esteban </w:t>
-      </w:r>
-      <w:proofErr w:type="spellStart"/>
-      <w:r>
-        <w:t>Garcia</w:t>
-      </w:r>
-      <w:proofErr w:type="spellEnd"/>
+        <w:t>Juan Esteban Garcia</w:t>
+      </w:r>
     </w:p>
     <w:p>
       <w:pPr>
@@ -154,31 +144,15 @@
         <w:ind w:firstLine="0"/>
       </w:pPr>
       <w:r>
-        <w:t xml:space="preserve">El presente informe resume los principales hallazgos obtenidos después del proceso de limpieza, integración y análisis de los datos suministrados por </w:t>
-      </w:r>
-      <w:proofErr w:type="spellStart"/>
-      <w:r>
-        <w:t>TechLogistics</w:t>
-      </w:r>
-      <w:proofErr w:type="spellEnd"/>
-      <w:r>
-        <w:t xml:space="preserve"> S.A.S. El objetivo fue responder cinco preguntas estratégicas relacionadas con la rentabilidad, la operación logística, el control del inventario y la satisfacción de los clientes.</w:t>
-      </w:r>
-    </w:p>
-    <w:p>
-      <w:pPr>
-        <w:ind w:firstLine="0"/>
-      </w:pPr>
-      <w:r>
-        <w:t xml:space="preserve">Durante el desarrollo del proyecto se corrigieron inconsistencias, valores faltantes, duplicados y problemas de integración entre las diferentes fuentes de información. Posteriormente se desarrolló un </w:t>
-      </w:r>
-      <w:proofErr w:type="spellStart"/>
-      <w:r>
-        <w:t>dashboard</w:t>
-      </w:r>
-      <w:proofErr w:type="spellEnd"/>
-      <w:r>
-        <w:t xml:space="preserve"> interactivo que permitió visualizar indicadores clave y apoyar la toma de decisiones basada en evidencia.</w:t>
+        <w:t>El presente informe resume los principales hallazgos obtenidos después del proceso de limpieza, integración y análisis de los datos suministrados por TechLogistics S.A.S. El objetivo fue responder cinco preguntas estratégicas relacionadas con la rentabilidad, la operación logística, el control del inventario y la satisfacción de los clientes.</w:t>
+      </w:r>
+    </w:p>
+    <w:p>
+      <w:pPr>
+        <w:ind w:firstLine="0"/>
+      </w:pPr>
+      <w:r>
+        <w:t>Durante el desarrollo del proyecto se corrigieron inconsistencias, valores faltantes, duplicados y problemas de integración entre las diferentes fuentes de información. Posteriormente se desarrolló un dashboard interactivo que permitió visualizar indicadores clave y apoyar la toma de decisiones basada en evidencia.</w:t>
       </w:r>
     </w:p>
     <w:p>
@@ -242,34 +216,16 @@
       <w:r>
         <w:t xml:space="preserve">Ilustración </w:t>
       </w:r>
-      <w:r>
-        <w:fldChar w:fldCharType="begin"/>
-      </w:r>
-      <w:r>
-        <w:instrText xml:space="preserve"> SEQ Ilustración \* ARABIC </w:instrText>
-      </w:r>
-      <w:r>
-        <w:fldChar w:fldCharType="separate"/>
-      </w:r>
-      <w:r>
-        <w:rPr>
-          <w:noProof/>
-        </w:rPr>
-        <w:t>1</w:t>
-      </w:r>
-      <w:r>
-        <w:fldChar w:fldCharType="end"/>
-      </w:r>
-      <w:r>
-        <w:t xml:space="preserve">. Resumen Ejecutivo </w:t>
-      </w:r>
-      <w:proofErr w:type="spellStart"/>
-      <w:r>
-        <w:t>Dashboard</w:t>
-      </w:r>
-      <w:proofErr w:type="spellEnd"/>
-      <w:r>
-        <w:t>.</w:t>
+      <w:fldSimple w:instr=" SEQ Ilustración \* ARABIC ">
+        <w:r>
+          <w:rPr>
+            <w:noProof/>
+          </w:rPr>
+          <w:t>1</w:t>
+        </w:r>
+      </w:fldSimple>
+      <w:r>
+        <w:t>. Resumen Ejecutivo Dashboard.</w:t>
       </w:r>
     </w:p>
     <w:p/>
@@ -353,24 +309,14 @@
       <w:r>
         <w:t xml:space="preserve">Ilustración </w:t>
       </w:r>
-      <w:r>
-        <w:fldChar w:fldCharType="begin"/>
-      </w:r>
-      <w:r>
-        <w:instrText xml:space="preserve"> SEQ Ilustración \* ARABIC </w:instrText>
-      </w:r>
-      <w:r>
-        <w:fldChar w:fldCharType="separate"/>
-      </w:r>
-      <w:r>
-        <w:rPr>
-          <w:noProof/>
-        </w:rPr>
-        <w:t>2</w:t>
-      </w:r>
-      <w:r>
-        <w:fldChar w:fldCharType="end"/>
-      </w:r>
+      <w:fldSimple w:instr=" SEQ Ilustración \* ARABIC ">
+        <w:r>
+          <w:rPr>
+            <w:noProof/>
+          </w:rPr>
+          <w:t>2</w:t>
+        </w:r>
+      </w:fldSimple>
       <w:r>
         <w:t>. % Ventas Margen Negativo vs Canal de Venta</w:t>
       </w:r>
@@ -389,7 +335,13 @@
         <w:t xml:space="preserve"> 2</w:t>
       </w:r>
       <w:r>
-        <w:t xml:space="preserve"> evidencia que el 38.7% de las transacciones en total son transacciones de margen negativo, acumulando perdidas de alrededor de 11.3 millones de dólares. La distribución de transacciones de margen negativo es muy similar para los 4 canales de venta disponibles. Este comportamiento de similitud en los canales </w:t>
+        <w:t xml:space="preserve"> evidencia que el 38.7% de las transacciones en total son transacciones de margen negativo, acumulando p</w:t>
+      </w:r>
+      <w:r>
+        <w:t>é</w:t>
+      </w:r>
+      <w:r>
+        <w:t xml:space="preserve">rdidas de alrededor de 11.3 millones de dólares. La distribución de transacciones de margen negativo es muy similar para los 4 canales de venta disponibles. Este comportamiento de similitud en los canales </w:t>
       </w:r>
       <w:r>
         <w:t xml:space="preserve">lleva a la conclusión que el problema no corresponde </w:t>
@@ -398,10 +350,7 @@
         <w:t xml:space="preserve">a </w:t>
       </w:r>
       <w:r>
-        <w:t>un fenómeno de volumen</w:t>
-      </w:r>
-      <w:r>
-        <w:t xml:space="preserve"> </w:t>
+        <w:t xml:space="preserve">un fenómeno de volumen </w:t>
       </w:r>
       <w:r>
         <w:t>(ventas con margen negativo que son compensada con aumento en ventas por otros canales), sino a un problema relacionado con costos, precios o ambas variables.</w:t>
@@ -412,23 +361,13 @@
         <w:ind w:firstLine="0"/>
       </w:pPr>
       <w:r>
-        <w:t xml:space="preserve">Se recomienda hacer una revisión de los </w:t>
-      </w:r>
-      <w:proofErr w:type="spellStart"/>
-      <w:r>
-        <w:t>SKUs</w:t>
-      </w:r>
-      <w:proofErr w:type="spellEnd"/>
-      <w:r>
-        <w:t xml:space="preserve"> con mayor </w:t>
-      </w:r>
-      <w:proofErr w:type="spellStart"/>
-      <w:r>
-        <w:t>perdida</w:t>
-      </w:r>
-      <w:proofErr w:type="spellEnd"/>
-      <w:r>
-        <w:t xml:space="preserve"> acumulada, comparar los costos de mantenimiento de los servicios frente al precio de venta, analizar categorías con mayor perdida. </w:t>
+        <w:t>Se recomienda hacer una revisión de los SKUs con mayor p</w:t>
+      </w:r>
+      <w:r>
+        <w:t>é</w:t>
+      </w:r>
+      <w:r>
+        <w:t xml:space="preserve">rdida acumulada, comparar los costos de mantenimiento de los servicios frente al precio de venta, analizar categorías con mayor perdida. </w:t>
       </w:r>
     </w:p>
     <w:p>
@@ -437,7 +376,13 @@
       </w:pPr>
       <w:r>
         <w:lastRenderedPageBreak/>
-        <w:t>Crisi Logística y Cuellos de Botella</w:t>
+        <w:t>Crisi</w:t>
+      </w:r>
+      <w:r>
+        <w:t>s</w:t>
+      </w:r>
+      <w:r>
+        <w:t xml:space="preserve"> Logística y Cuellos de Botella</w:t>
       </w:r>
     </w:p>
     <w:p>
@@ -494,24 +439,14 @@
       <w:r>
         <w:t xml:space="preserve">Ilustración </w:t>
       </w:r>
-      <w:r>
-        <w:fldChar w:fldCharType="begin"/>
-      </w:r>
-      <w:r>
-        <w:instrText xml:space="preserve"> SEQ Ilustración \* ARABIC </w:instrText>
-      </w:r>
-      <w:r>
-        <w:fldChar w:fldCharType="separate"/>
-      </w:r>
-      <w:r>
-        <w:rPr>
-          <w:noProof/>
-        </w:rPr>
-        <w:t>3</w:t>
-      </w:r>
-      <w:r>
-        <w:fldChar w:fldCharType="end"/>
-      </w:r>
+      <w:fldSimple w:instr=" SEQ Ilustración \* ARABIC ">
+        <w:r>
+          <w:rPr>
+            <w:noProof/>
+          </w:rPr>
+          <w:t>3</w:t>
+        </w:r>
+      </w:fldSimple>
       <w:r>
         <w:t>. Tiempo de Entrega vs NPS (Ciudad y Bodega)</w:t>
       </w:r>
@@ -521,13 +456,10 @@
         <w:ind w:firstLine="0"/>
       </w:pPr>
       <w:r>
-        <w:t>Las correlaciones obtenidas son cercanas a cero y ninguna supera una magnitud de 0.1.</w:t>
-      </w:r>
-      <w:r>
-        <w:t xml:space="preserve"> </w:t>
-      </w:r>
-      <w:r>
-        <w:t xml:space="preserve">Esto nos permite afirmar que la correlación no es lo suficientemente fuerte como para que se explique que la satisfacción de los clientes se ve afectada cuando hay altos tiempos de entrega de los productos. Es posible que la insatisfacción del cliente se vea realmente por otro tipo de variables como el mismo producto, el precios, entre otras. </w:t>
+        <w:t xml:space="preserve">Las correlaciones obtenidas son cercanas a cero y ninguna supera una magnitud de 0.1. </w:t>
+      </w:r>
+      <w:r>
+        <w:t xml:space="preserve">Esto nos permite afirmar que la correlación no es lo suficientemente fuerte como para que se explique que la satisfacción de los clientes se ve afectada cuando hay altos tiempos de entrega de los productos. Es posible que la insatisfacción del cliente se vea realmente por otro tipo de variables como el mismo producto, el precio, entre otras. </w:t>
       </w:r>
     </w:p>
     <w:p>
@@ -615,80 +547,71 @@
       <w:r>
         <w:t xml:space="preserve">Ilustración </w:t>
       </w:r>
-      <w:r>
-        <w:fldChar w:fldCharType="begin"/>
-      </w:r>
-      <w:r>
-        <w:instrText xml:space="preserve"> SEQ Ilustración \* ARABIC </w:instrText>
-      </w:r>
-      <w:r>
-        <w:fldChar w:fldCharType="separate"/>
-      </w:r>
+      <w:fldSimple w:instr=" SEQ Ilustración \* ARABIC ">
+        <w:r>
+          <w:rPr>
+            <w:noProof/>
+          </w:rPr>
+          <w:t>4</w:t>
+        </w:r>
+      </w:fldSimple>
+      <w:r>
+        <w:t>. Transacciones Fantasma.</w:t>
+      </w:r>
+    </w:p>
+    <w:p>
+      <w:pPr>
+        <w:ind w:firstLine="0"/>
+      </w:pPr>
+      <w:r>
+        <w:t>Constituye uno de los hallazgos más relevantes del proyecto</w:t>
+      </w:r>
+      <w:r>
+        <w:t xml:space="preserve">, luego del análisis de fuga de capital y rendimiento. Se identificó que el alrededor del 17.4% de los ingresos totales provienen de transacciones cuyo producto asociado no se encuentra dentro del inventario. Para este caso los identificamos como SKU fantasma. </w:t>
+      </w:r>
+    </w:p>
+    <w:p>
+      <w:pPr>
+        <w:ind w:firstLine="0"/>
+      </w:pPr>
+      <w:r>
+        <w:t xml:space="preserve">Aunque estas transacciones representan ingresos reales para la empresa, </w:t>
+      </w:r>
+      <w:r>
+        <w:t>la falta de estos productos en el inventario impide calcular correctamente el margen de rentabilidad de la organización. Esto significa que no podemos calcular el desempeño financiero de la compañía y evidencia problemas de comunicación o coordinación entre los equipos comerciales y logística (inventarios).</w:t>
+      </w:r>
+    </w:p>
+    <w:p>
+      <w:pPr>
+        <w:ind w:firstLine="0"/>
+      </w:pPr>
+      <w:r>
+        <w:t xml:space="preserve">Se recomienda urgentemente actualizar el catálogo de productos en el inventario maestro y realizar auditoría periódica sobre el inventario de productos y servicios. </w:t>
+      </w:r>
+    </w:p>
+    <w:p>
+      <w:pPr>
+        <w:pStyle w:val="Ttulo2"/>
+      </w:pPr>
+      <w:r>
+        <w:lastRenderedPageBreak/>
+        <w:t>D</w:t>
+      </w:r>
+      <w:r>
+        <w:t>iag</w:t>
+      </w:r>
+      <w:r>
+        <w:t>nóstico de Fidelidad del Cliente</w:t>
+      </w:r>
+    </w:p>
+    <w:p>
+      <w:pPr>
+        <w:pStyle w:val="Portada"/>
+        <w:keepNext/>
+      </w:pPr>
       <w:r>
         <w:rPr>
           <w:noProof/>
-        </w:rPr>
-        <w:t>4</w:t>
-      </w:r>
-      <w:r>
-        <w:fldChar w:fldCharType="end"/>
-      </w:r>
-      <w:r>
-        <w:t>. Transacciones Fantasma.</w:t>
-      </w:r>
-    </w:p>
-    <w:p>
-      <w:pPr>
-        <w:ind w:firstLine="0"/>
-      </w:pPr>
-      <w:r>
-        <w:t>Constituye uno de los hallazgos más relevantes del proyecto</w:t>
-      </w:r>
-      <w:r>
-        <w:t xml:space="preserve">, luego del análisis de fuga de capital y rendimiento. Se identificó que el alrededor del 17.4% de los ingresos totales provienen de transacciones cuyo producto asociado no se encuentra dentro del inventario. Para este caso los identificamos como SKU fantasma. </w:t>
-      </w:r>
-    </w:p>
-    <w:p>
-      <w:pPr>
-        <w:ind w:firstLine="0"/>
-      </w:pPr>
-      <w:r>
-        <w:t xml:space="preserve">Aunque estas transacciones representan ingresos reales para la empresa, </w:t>
-      </w:r>
-      <w:r>
-        <w:t>la falta de estos productos en el inventario impide calcular correctamente el margen de rentabilidad de la organización. Esto significa que no podemos calcular el desempeño financiero de la compañía y evidencia problemas de comunicación o coordinación entre los equipos comerciales y logística (inventarios).</w:t>
-      </w:r>
-    </w:p>
-    <w:p>
-      <w:pPr>
-        <w:ind w:firstLine="0"/>
-      </w:pPr>
-      <w:r>
-        <w:t xml:space="preserve">Se recomienda urgentemente actualizar el catálogo de productos en el inventario maestro y realizar auditoría periódica sobre el inventario de productos y servicios. </w:t>
-      </w:r>
-    </w:p>
-    <w:p>
-      <w:pPr>
-        <w:pStyle w:val="Ttulo2"/>
-      </w:pPr>
-      <w:r>
-        <w:lastRenderedPageBreak/>
-        <w:t>D</w:t>
-      </w:r>
-      <w:r>
-        <w:t>iag</w:t>
-      </w:r>
-      <w:r>
-        <w:t>nóstico de Fidelidad del Cliente</w:t>
-      </w:r>
-    </w:p>
-    <w:p>
-      <w:pPr>
-        <w:pStyle w:val="Portada"/>
-        <w:keepNext/>
-      </w:pPr>
-      <w:r>
-        <w:rPr>
           <w:lang w:val="en-US"/>
         </w:rPr>
         <w:drawing>
@@ -734,10 +657,7 @@
         <w:ind w:firstLine="0"/>
       </w:pPr>
       <w:r>
-        <w:t xml:space="preserve">Ilustración </w:t>
-      </w:r>
-      <w:r>
-        <w:t>5. Stock Promedio Disponible vs NPS Promedio</w:t>
+        <w:t>Ilustración 5. Stock Promedio Disponible vs NPS Promedio</w:t>
       </w:r>
     </w:p>
     <w:p>
@@ -771,21 +691,12 @@
       <w:r>
         <w:t xml:space="preserve">inventario disponible alto y satisfacción de clientes baja: </w:t>
       </w:r>
-      <w:proofErr w:type="spellStart"/>
       <w:r>
         <w:rPr>
           <w:b/>
           <w:bCs/>
         </w:rPr>
-        <w:t>Smarthphones</w:t>
-      </w:r>
-      <w:proofErr w:type="spellEnd"/>
-      <w:r>
-        <w:rPr>
-          <w:b/>
-          <w:bCs/>
-        </w:rPr>
-        <w:t xml:space="preserve"> </w:t>
+        <w:t xml:space="preserve">Smarthphones </w:t>
       </w:r>
       <w:r>
         <w:t xml:space="preserve">y </w:t>
@@ -806,10 +717,7 @@
         <w:ind w:firstLine="0"/>
       </w:pPr>
       <w:r>
-        <w:t>Con la información disponible no es posible determinar si el bajo nivel de satisfacción está asociado principalmente a problemas de precio, calidad del producto o una combinación de ambos factores. Precisamente esa es la paradoja identificada en este análisis.</w:t>
-      </w:r>
-      <w:r>
-        <w:t xml:space="preserve"> </w:t>
+        <w:t xml:space="preserve">Con la información disponible no es posible determinar si el bajo nivel de satisfacción está asociado principalmente a problemas de precio, calidad del producto o una combinación de ambos factores. Precisamente esa es la paradoja identificada en este análisis. </w:t>
       </w:r>
     </w:p>
     <w:p>
@@ -835,6 +743,9 @@
         <w:keepNext/>
       </w:pPr>
       <w:r>
+        <w:rPr>
+          <w:noProof/>
+        </w:rPr>
         <w:drawing>
           <wp:inline distT="0" distB="0" distL="0" distR="0" wp14:anchorId="0BF5B329" wp14:editId="3C274821">
             <wp:extent cx="5942167" cy="3040380"/>
@@ -894,10 +805,7 @@
         <w:t xml:space="preserve">La única que se encuentra en el cuadrante superior derecho es la bodega de Occidente, lo que indica que esta bodega puede estar operando con inventario sin revisión durante mucho tiempo y está generando más tickets de soporte que el promedio de bodegas. </w:t>
       </w:r>
       <w:r>
-        <w:t>Este comportamiento la convierte en el principal candidato a estar operando con información de inventario desactualizada, aunque sería necesario complementar el análisis con variables operativas para confirmar esta hipótesis.</w:t>
-      </w:r>
-      <w:r>
-        <w:t xml:space="preserve"> </w:t>
+        <w:t xml:space="preserve">Este comportamiento la convierte en el principal candidato a estar operando con información de inventario desactualizada, aunque sería necesario complementar el análisis con variables operativas para confirmar esta hipótesis. </w:t>
       </w:r>
     </w:p>
     <w:p>
@@ -929,6 +837,125 @@
       </w:pPr>
       <w:r>
         <w:t xml:space="preserve">Se recomienda realizar una auditoría interna operativa de la bodega de Occidente, revisando la frecuencia de revisión de la bodega y los procesos de generación de tickets. Adicionalmente, sería importante incluir variables de logística en el análisis. </w:t>
+      </w:r>
+    </w:p>
+    <w:p>
+      <w:pPr>
+        <w:pStyle w:val="Ttulo1"/>
+      </w:pPr>
+      <w:r>
+        <w:t>Plan de Acción</w:t>
+      </w:r>
+    </w:p>
+    <w:p>
+      <w:r>
+        <w:t>A partir de los hallazgos anteriores se plantean tres recomendaciones tácticas, numeradas y priorizadas según su complejidad de implementación (baja, media y alta), orientadas a atender de manera escalonada los riesgos identificados.</w:t>
+      </w:r>
+    </w:p>
+    <w:p>
+      <w:pPr>
+        <w:pStyle w:val="Ttulo2"/>
+      </w:pPr>
+      <w:r>
+        <w:t xml:space="preserve">1. Auditoría y saneamiento del catálogo e inventario </w:t>
+      </w:r>
+      <w:r>
+        <w:t>-</w:t>
+      </w:r>
+      <w:r>
+        <w:t xml:space="preserve"> Complejidad: Baja</w:t>
+      </w:r>
+    </w:p>
+    <w:p>
+      <w:pPr>
+        <w:ind w:firstLine="0"/>
+      </w:pPr>
+      <w:r>
+        <w:t>Como medida de corto plazo se recomienda actualizar el catálogo maestro de inventario incorporando los SKU actualmente clasificados como fantasma, y programar de forma prioritaria la revisión física de la bodega Occidente, identificada como la de mayor antigüedad de revisión y mayor tasa de tickets de soporte. Est</w:t>
+      </w:r>
+      <w:r>
+        <w:t>o</w:t>
+      </w:r>
+      <w:r>
+        <w:t xml:space="preserve"> no requiere cambios en los sistemas existentes, solo un esfuerzo operativo, y permite recuperar trazabilidad sobre </w:t>
+      </w:r>
+      <w:r>
+        <w:t>alrededor</w:t>
+      </w:r>
+      <w:r>
+        <w:t xml:space="preserve"> del 17.4% de los ingresos que hoy no pueden asociarse a un costo ni a un producto formal.</w:t>
+      </w:r>
+    </w:p>
+    <w:p>
+      <w:pPr>
+        <w:pStyle w:val="Ttulo2"/>
+      </w:pPr>
+      <w:r>
+        <w:t xml:space="preserve">2. Revisión de la política de precios y costos por categoría </w:t>
+      </w:r>
+      <w:r>
+        <w:t xml:space="preserve">- </w:t>
+      </w:r>
+      <w:r>
+        <w:t>Complejidad: Media</w:t>
+      </w:r>
+    </w:p>
+    <w:p>
+      <w:pPr>
+        <w:ind w:firstLine="0"/>
+      </w:pPr>
+      <w:r>
+        <w:t xml:space="preserve">Se recomienda realizar una revisión </w:t>
+      </w:r>
+      <w:r>
+        <w:t>en conjunto</w:t>
+      </w:r>
+      <w:r>
+        <w:t xml:space="preserve"> entre las áreas comercial y financiera de los costos de adquisición y los precios de venta por SKU, priorizando las categorías con mayor pérdida acumulada y aquellas identificadas en la paradoja de fidelidad (Smartphones y Sin Categoría). Est</w:t>
+      </w:r>
+      <w:r>
+        <w:t xml:space="preserve">o </w:t>
+      </w:r>
+      <w:r>
+        <w:t xml:space="preserve">implica </w:t>
+      </w:r>
+      <w:r>
+        <w:t>mezclar</w:t>
+      </w:r>
+      <w:r>
+        <w:t xml:space="preserve"> información de varias áreas y eventualmente ajustar tarifas o </w:t>
+      </w:r>
+      <w:r>
+        <w:lastRenderedPageBreak/>
+        <w:t>descontinuar productos con pérdida estructural, por lo que su implementación requiere mayor coordinación y tiempo que la anterior, aunque no exige cambios tecnológicos de fondo.</w:t>
+      </w:r>
+    </w:p>
+    <w:p>
+      <w:pPr>
+        <w:pStyle w:val="Ttulo2"/>
+      </w:pPr>
+      <w:r>
+        <w:t xml:space="preserve">3. Rediseño de la integración de datos entre Inventario, Logística y Feedback </w:t>
+      </w:r>
+      <w:r>
+        <w:t xml:space="preserve">- </w:t>
+      </w:r>
+      <w:r>
+        <w:t>Complejidad: Alta</w:t>
+      </w:r>
+    </w:p>
+    <w:p>
+      <w:pPr>
+        <w:ind w:firstLine="0"/>
+      </w:pPr>
+      <w:r>
+        <w:t xml:space="preserve">Como medida de largo plazo se recomienda rediseñar el proceso de integración entre los sistemas de Inventario, Logística y Feedback, incorporando validaciones que </w:t>
+      </w:r>
+      <w:r>
+        <w:t>no permitan</w:t>
+      </w:r>
+      <w:r>
+        <w:t xml:space="preserve"> registrar una venta sin un SKU existente en el maestro de productos, y capturando nuevas variables de experiencia del cliente, más allá del tiempo de entrega, que permitan explicar mejor la insatisfacción reportada. Esta recomendación tiene la mayor complejidad porque implica cambios en los sistemas de información y la coordinación de varios equipos técnicos, pero es la única que ataca la causa raíz de la invisibilidad operativa señalada en este informe.</w:t>
       </w:r>
     </w:p>
     <w:p>
@@ -993,7 +1020,7 @@
 </file>
 
 <file path=word/endnotes.xml><?xml version="1.0" encoding="utf-8"?>
-<w:endnotes xmlns:wpc="http://schemas.microsoft.com/office/word/2010/wordprocessingCanvas" xmlns:cx="http://schemas.microsoft.com/office/drawing/2014/chartex" xmlns:cx1="http://schemas.microsoft.com/office/drawing/2015/9/8/chartex" xmlns:cx2="http://schemas.microsoft.com/office/drawing/2015/10/21/chartex" xmlns:cx3="http://schemas.microsoft.com/office/drawing/2016/5/9/chartex" xmlns:cx4="http://schemas.microsoft.com/office/drawing/2016/5/10/chartex" xmlns:cx5="http://schemas.microsoft.com/office/drawing/2016/5/11/chartex" xmlns:cx6="http://schemas.microsoft.com/office/drawing/2016/5/12/chartex" xmlns:cx7="http://schemas.microsoft.com/office/drawing/2016/5/13/chartex" xmlns:cx8="http://schemas.microsoft.com/office/drawing/2016/5/14/chartex" xmlns:mc="http://schemas.openxmlformats.org/markup-compatibility/2006" xmlns:aink="http://schemas.microsoft.com/office/drawing/2016/ink" xmlns:am3d="http://schemas.microsoft.com/office/drawing/2017/model3d" xmlns:o="urn:schemas-microsoft-com:office:office" xmlns:oel="http://schemas.microsoft.com/office/2019/extlst" xmlns:r="http://schemas.openxmlformats.org/officeDocument/2006/relationships" xmlns:m="http://schemas.openxmlformats.org/officeDocument/2006/math" xmlns:v="urn:schemas-microsoft-com:vml" xmlns:wp14="http://schemas.microsoft.com/office/word/2010/wordprocessingDrawing" xmlns:wp="http://schemas.openxmlformats.org/drawingml/2006/wordprocessingDrawing" xmlns:w10="urn:schemas-microsoft-com:office:word" xmlns:w="http://schemas.openxmlformats.org/wordprocessingml/2006/main" xmlns:w14="http://schemas.microsoft.com/office/word/2010/wordml" xmlns:w15="http://schemas.microsoft.com/office/word/2012/wordml" xmlns:w16cex="http://schemas.microsoft.com/office/word/2018/wordml/cex" xmlns:w16cid="http://schemas.microsoft.com/office/word/2016/wordml/cid" xmlns:w16="http://schemas.microsoft.com/office/word/2018/wordml" xmlns:w16du="http://schemas.microsoft.com/office/word/2023/wordml/word16du" xmlns:w16sdtdh="http://schemas.microsoft.com/office/word/2020/wordml/sdtdatahash" xmlns:w16sdtfl="http://schemas.microsoft.com/office/word/2024/wordml/sdtformatlock" xmlns:w16se="http://schemas.microsoft.com/office/word/2015/wordml/symex" xmlns:wpg="http://schemas.microsoft.com/office/word/2010/wordprocessingGroup" xmlns:wpi="http://schemas.microsoft.com/office/word/2010/wordprocessingInk" xmlns:wne="http://schemas.microsoft.com/office/word/2006/wordml" xmlns:wps="http://schemas.microsoft.com/office/word/2010/wordprocessingShape" mc:Ignorable="w14 w15 w16se w16cid w16 w16cex w16sdtdh w16sdtfl w16du wp14">
+<w:endnotes xmlns:wpc="http://schemas.microsoft.com/office/word/2010/wordprocessingCanvas" xmlns:cx="http://schemas.microsoft.com/office/drawing/2014/chartex" xmlns:cx1="http://schemas.microsoft.com/office/drawing/2015/9/8/chartex" xmlns:cx2="http://schemas.microsoft.com/office/drawing/2015/10/21/chartex" xmlns:cx3="http://schemas.microsoft.com/office/drawing/2016/5/9/chartex" xmlns:cx4="http://schemas.microsoft.com/office/drawing/2016/5/10/chartex" xmlns:cx5="http://schemas.microsoft.com/office/drawing/2016/5/11/chartex" xmlns:cx6="http://schemas.microsoft.com/office/drawing/2016/5/12/chartex" xmlns:cx7="http://schemas.microsoft.com/office/drawing/2016/5/13/chartex" xmlns:cx8="http://schemas.microsoft.com/office/drawing/2016/5/14/chartex" xmlns:mc="http://schemas.openxmlformats.org/markup-compatibility/2006" xmlns:aink="http://schemas.microsoft.com/office/drawing/2016/ink" xmlns:am3d="http://schemas.microsoft.com/office/drawing/2017/model3d" xmlns:o="urn:schemas-microsoft-com:office:office" xmlns:oel="http://schemas.microsoft.com/office/2019/extlst" xmlns:r="http://schemas.openxmlformats.org/officeDocument/2006/relationships" xmlns:m="http://schemas.openxmlformats.org/officeDocument/2006/math" xmlns:v="urn:schemas-microsoft-com:vml" xmlns:wp14="http://schemas.microsoft.com/office/word/2010/wordprocessingDrawing" xmlns:wp="http://schemas.openxmlformats.org/drawingml/2006/wordprocessingDrawing" xmlns:w10="urn:schemas-microsoft-com:office:word" xmlns:w="http://schemas.openxmlformats.org/wordprocessingml/2006/main" xmlns:w14="http://schemas.microsoft.com/office/word/2010/wordml" xmlns:w15="http://schemas.microsoft.com/office/word/2012/wordml" xmlns:w16cei="http://schemas.microsoft.com/office/word/2026/wordml/cei" xmlns:w16cex="http://schemas.microsoft.com/office/word/2018/wordml/cex" xmlns:w16cid="http://schemas.microsoft.com/office/word/2016/wordml/cid" xmlns:w16="http://schemas.microsoft.com/office/word/2018/wordml" xmlns:w16du="http://schemas.microsoft.com/office/word/2023/wordml/word16du" xmlns:w16sdtdh="http://schemas.microsoft.com/office/word/2020/wordml/sdtdatahash" xmlns:w16sdtfl="http://schemas.microsoft.com/office/word/2024/wordml/sdtformatlock" xmlns:w16se="http://schemas.microsoft.com/office/word/2015/wordml/symex" xmlns:wpg="http://schemas.microsoft.com/office/word/2010/wordprocessingGroup" xmlns:wpi="http://schemas.microsoft.com/office/word/2010/wordprocessingInk" xmlns:wne="http://schemas.microsoft.com/office/word/2006/wordml" xmlns:wps="http://schemas.microsoft.com/office/word/2010/wordprocessingShape" mc:Ignorable="w14 w15 w16se w16cid w16 w16cex w16sdtdh w16sdtfl w16du wp14">
   <w:endnote w:type="separator" w:id="-1">
     <w:p>
       <w:pPr>
@@ -1018,7 +1045,7 @@
 </file>
 
 <file path=word/footnotes.xml><?xml version="1.0" encoding="utf-8"?>
-<w:footnotes xmlns:wpc="http://schemas.microsoft.com/office/word/2010/wordprocessingCanvas" xmlns:cx="http://schemas.microsoft.com/office/drawing/2014/chartex" xmlns:cx1="http://schemas.microsoft.com/office/drawing/2015/9/8/chartex" xmlns:cx2="http://schemas.microsoft.com/office/drawing/2015/10/21/chartex" xmlns:cx3="http://schemas.microsoft.com/office/drawing/2016/5/9/chartex" xmlns:cx4="http://schemas.microsoft.com/office/drawing/2016/5/10/chartex" xmlns:cx5="http://schemas.microsoft.com/office/drawing/2016/5/11/chartex" xmlns:cx6="http://schemas.microsoft.com/office/drawing/2016/5/12/chartex" xmlns:cx7="http://schemas.microsoft.com/office/drawing/2016/5/13/chartex" xmlns:cx8="http://schemas.microsoft.com/office/drawing/2016/5/14/chartex" xmlns:mc="http://schemas.openxmlformats.org/markup-compatibility/2006" xmlns:aink="http://schemas.microsoft.com/office/drawing/2016/ink" xmlns:am3d="http://schemas.microsoft.com/office/drawing/2017/model3d" xmlns:o="urn:schemas-microsoft-com:office:office" xmlns:oel="http://schemas.microsoft.com/office/2019/extlst" xmlns:r="http://schemas.openxmlformats.org/officeDocument/2006/relationships" xmlns:m="http://schemas.openxmlformats.org/officeDocument/2006/math" xmlns:v="urn:schemas-microsoft-com:vml" xmlns:wp14="http://schemas.microsoft.com/office/word/2010/wordprocessingDrawing" xmlns:wp="http://schemas.openxmlformats.org/drawingml/2006/wordprocessingDrawing" xmlns:w10="urn:schemas-microsoft-com:office:word" xmlns:w="http://schemas.openxmlformats.org/wordprocessingml/2006/main" xmlns:w14="http://schemas.microsoft.com/office/word/2010/wordml" xmlns:w15="http://schemas.microsoft.com/office/word/2012/wordml" xmlns:w16cex="http://schemas.microsoft.com/office/word/2018/wordml/cex" xmlns:w16cid="http://schemas.microsoft.com/office/word/2016/wordml/cid" xmlns:w16="http://schemas.microsoft.com/office/word/2018/wordml" xmlns:w16du="http://schemas.microsoft.com/office/word/2023/wordml/word16du" xmlns:w16sdtdh="http://schemas.microsoft.com/office/word/2020/wordml/sdtdatahash" xmlns:w16sdtfl="http://schemas.microsoft.com/office/word/2024/wordml/sdtformatlock" xmlns:w16se="http://schemas.microsoft.com/office/word/2015/wordml/symex" xmlns:wpg="http://schemas.microsoft.com/office/word/2010/wordprocessingGroup" xmlns:wpi="http://schemas.microsoft.com/office/word/2010/wordprocessingInk" xmlns:wne="http://schemas.microsoft.com/office/word/2006/wordml" xmlns:wps="http://schemas.microsoft.com/office/word/2010/wordprocessingShape" mc:Ignorable="w14 w15 w16se w16cid w16 w16cex w16sdtdh w16sdtfl w16du wp14">
+<w:footnotes xmlns:wpc="http://schemas.microsoft.com/office/word/2010/wordprocessingCanvas" xmlns:cx="http://schemas.microsoft.com/office/drawing/2014/chartex" xmlns:cx1="http://schemas.microsoft.com/office/drawing/2015/9/8/chartex" xmlns:cx2="http://schemas.microsoft.com/office/drawing/2015/10/21/chartex" xmlns:cx3="http://schemas.microsoft.com/office/drawing/2016/5/9/chartex" xmlns:cx4="http://schemas.microsoft.com/office/drawing/2016/5/10/chartex" xmlns:cx5="http://schemas.microsoft.com/office/drawing/2016/5/11/chartex" xmlns:cx6="http://schemas.microsoft.com/office/drawing/2016/5/12/chartex" xmlns:cx7="http://schemas.microsoft.com/office/drawing/2016/5/13/chartex" xmlns:cx8="http://schemas.microsoft.com/office/drawing/2016/5/14/chartex" xmlns:mc="http://schemas.openxmlformats.org/markup-compatibility/2006" xmlns:aink="http://schemas.microsoft.com/office/drawing/2016/ink" xmlns:am3d="http://schemas.microsoft.com/office/drawing/2017/model3d" xmlns:o="urn:schemas-microsoft-com:office:office" xmlns:oel="http://schemas.microsoft.com/office/2019/extlst" xmlns:r="http://schemas.openxmlformats.org/officeDocument/2006/relationships" xmlns:m="http://schemas.openxmlformats.org/officeDocument/2006/math" xmlns:v="urn:schemas-microsoft-com:vml" xmlns:wp14="http://schemas.microsoft.com/office/word/2010/wordprocessingDrawing" xmlns:wp="http://schemas.openxmlformats.org/drawingml/2006/wordprocessingDrawing" xmlns:w10="urn:schemas-microsoft-com:office:word" xmlns:w="http://schemas.openxmlformats.org/wordprocessingml/2006/main" xmlns:w14="http://schemas.microsoft.com/office/word/2010/wordml" xmlns:w15="http://schemas.microsoft.com/office/word/2012/wordml" xmlns:w16cei="http://schemas.microsoft.com/office/word/2026/wordml/cei" xmlns:w16cex="http://schemas.microsoft.com/office/word/2018/wordml/cex" xmlns:w16cid="http://schemas.microsoft.com/office/word/2016/wordml/cid" xmlns:w16="http://schemas.microsoft.com/office/word/2018/wordml" xmlns:w16du="http://schemas.microsoft.com/office/word/2023/wordml/word16du" xmlns:w16sdtdh="http://schemas.microsoft.com/office/word/2020/wordml/sdtdatahash" xmlns:w16sdtfl="http://schemas.microsoft.com/office/word/2024/wordml/sdtformatlock" xmlns:w16se="http://schemas.microsoft.com/office/word/2015/wordml/symex" xmlns:wpg="http://schemas.microsoft.com/office/word/2010/wordprocessingGroup" xmlns:wpi="http://schemas.microsoft.com/office/word/2010/wordprocessingInk" xmlns:wne="http://schemas.microsoft.com/office/word/2006/wordml" xmlns:wps="http://schemas.microsoft.com/office/word/2010/wordprocessingShape" mc:Ignorable="w14 w15 w16se w16cid w16 w16cex w16sdtdh w16sdtfl w16du wp14">
   <w:footnote w:type="separator" w:id="-1">
     <w:p>
       <w:pPr>
@@ -1043,7 +1070,7 @@
 </file>
 
 <file path=word/header1.xml><?xml version="1.0" encoding="utf-8"?>
-<w:hdr xmlns:wpc="http://schemas.microsoft.com/office/word/2010/wordprocessingCanvas" xmlns:cx="http://schemas.microsoft.com/office/drawing/2014/chartex" xmlns:cx1="http://schemas.microsoft.com/office/drawing/2015/9/8/chartex" xmlns:cx2="http://schemas.microsoft.com/office/drawing/2015/10/21/chartex" xmlns:cx3="http://schemas.microsoft.com/office/drawing/2016/5/9/chartex" xmlns:cx4="http://schemas.microsoft.com/office/drawing/2016/5/10/chartex" xmlns:cx5="http://schemas.microsoft.com/office/drawing/2016/5/11/chartex" xmlns:cx6="http://schemas.microsoft.com/office/drawing/2016/5/12/chartex" xmlns:cx7="http://schemas.microsoft.com/office/drawing/2016/5/13/chartex" xmlns:cx8="http://schemas.microsoft.com/office/drawing/2016/5/14/chartex" xmlns:mc="http://schemas.openxmlformats.org/markup-compatibility/2006" xmlns:aink="http://schemas.microsoft.com/office/drawing/2016/ink" xmlns:am3d="http://schemas.microsoft.com/office/drawing/2017/model3d" xmlns:o="urn:schemas-microsoft-com:office:office" xmlns:oel="http://schemas.microsoft.com/office/2019/extlst" xmlns:r="http://schemas.openxmlformats.org/officeDocument/2006/relationships" xmlns:m="http://schemas.openxmlformats.org/officeDocument/2006/math" xmlns:v="urn:schemas-microsoft-com:vml" xmlns:wp14="http://schemas.microsoft.com/office/word/2010/wordprocessingDrawing" xmlns:wp="http://schemas.openxmlformats.org/drawingml/2006/wordprocessingDrawing" xmlns:w10="urn:schemas-microsoft-com:office:word" xmlns:w="http://schemas.openxmlformats.org/wordprocessingml/2006/main" xmlns:w14="http://schemas.microsoft.com/office/word/2010/wordml" xmlns:w15="http://schemas.microsoft.com/office/word/2012/wordml" xmlns:w16cex="http://schemas.microsoft.com/office/word/2018/wordml/cex" xmlns:w16cid="http://schemas.microsoft.com/office/word/2016/wordml/cid" xmlns:w16="http://schemas.microsoft.com/office/word/2018/wordml" xmlns:w16du="http://schemas.microsoft.com/office/word/2023/wordml/word16du" xmlns:w16sdtdh="http://schemas.microsoft.com/office/word/2020/wordml/sdtdatahash" xmlns:w16sdtfl="http://schemas.microsoft.com/office/word/2024/wordml/sdtformatlock" xmlns:w16se="http://schemas.microsoft.com/office/word/2015/wordml/symex" xmlns:wpg="http://schemas.microsoft.com/office/word/2010/wordprocessingGroup" xmlns:wpi="http://schemas.microsoft.com/office/word/2010/wordprocessingInk" xmlns:wne="http://schemas.microsoft.com/office/word/2006/wordml" xmlns:wps="http://schemas.microsoft.com/office/word/2010/wordprocessingShape" mc:Ignorable="w14 w15 w16se w16cid w16 w16cex w16sdtdh w16sdtfl w16du wp14">
+<w:hdr xmlns:wpc="http://schemas.microsoft.com/office/word/2010/wordprocessingCanvas" xmlns:cx="http://schemas.microsoft.com/office/drawing/2014/chartex" xmlns:cx1="http://schemas.microsoft.com/office/drawing/2015/9/8/chartex" xmlns:cx2="http://schemas.microsoft.com/office/drawing/2015/10/21/chartex" xmlns:cx3="http://schemas.microsoft.com/office/drawing/2016/5/9/chartex" xmlns:cx4="http://schemas.microsoft.com/office/drawing/2016/5/10/chartex" xmlns:cx5="http://schemas.microsoft.com/office/drawing/2016/5/11/chartex" xmlns:cx6="http://schemas.microsoft.com/office/drawing/2016/5/12/chartex" xmlns:cx7="http://schemas.microsoft.com/office/drawing/2016/5/13/chartex" xmlns:cx8="http://schemas.microsoft.com/office/drawing/2016/5/14/chartex" xmlns:mc="http://schemas.openxmlformats.org/markup-compatibility/2006" xmlns:aink="http://schemas.microsoft.com/office/drawing/2016/ink" xmlns:am3d="http://schemas.microsoft.com/office/drawing/2017/model3d" xmlns:o="urn:schemas-microsoft-com:office:office" xmlns:oel="http://schemas.microsoft.com/office/2019/extlst" xmlns:r="http://schemas.openxmlformats.org/officeDocument/2006/relationships" xmlns:m="http://schemas.openxmlformats.org/officeDocument/2006/math" xmlns:v="urn:schemas-microsoft-com:vml" xmlns:wp14="http://schemas.microsoft.com/office/word/2010/wordprocessingDrawing" xmlns:wp="http://schemas.openxmlformats.org/drawingml/2006/wordprocessingDrawing" xmlns:w10="urn:schemas-microsoft-com:office:word" xmlns:w="http://schemas.openxmlformats.org/wordprocessingml/2006/main" xmlns:w14="http://schemas.microsoft.com/office/word/2010/wordml" xmlns:w15="http://schemas.microsoft.com/office/word/2012/wordml" xmlns:w16cei="http://schemas.microsoft.com/office/word/2026/wordml/cei" xmlns:w16cex="http://schemas.microsoft.com/office/word/2018/wordml/cex" xmlns:w16cid="http://schemas.microsoft.com/office/word/2016/wordml/cid" xmlns:w16="http://schemas.microsoft.com/office/word/2018/wordml" xmlns:w16du="http://schemas.microsoft.com/office/word/2023/wordml/word16du" xmlns:w16sdtdh="http://schemas.microsoft.com/office/word/2020/wordml/sdtdatahash" xmlns:w16sdtfl="http://schemas.microsoft.com/office/word/2024/wordml/sdtformatlock" xmlns:w16se="http://schemas.microsoft.com/office/word/2015/wordml/symex" xmlns:wpg="http://schemas.microsoft.com/office/word/2010/wordprocessingGroup" xmlns:wpi="http://schemas.microsoft.com/office/word/2010/wordprocessingInk" xmlns:wne="http://schemas.microsoft.com/office/word/2006/wordml" xmlns:wps="http://schemas.microsoft.com/office/word/2010/wordprocessingShape" mc:Ignorable="w14 w15 w16se w16cid w16 w16cex w16sdtdh w16sdtfl w16du wp14">
   <w:p>
     <w:pPr>
       <w:pStyle w:val="Encabezado"/>
@@ -1077,7 +1104,7 @@
 </file>
 
 <file path=word/numbering.xml><?xml version="1.0" encoding="utf-8"?>
-<w:numbering xmlns:wpc="http://schemas.microsoft.com/office/word/2010/wordprocessingCanvas" xmlns:cx="http://schemas.microsoft.com/office/drawing/2014/chartex" xmlns:cx1="http://schemas.microsoft.com/office/drawing/2015/9/8/chartex" xmlns:cx2="http://schemas.microsoft.com/office/drawing/2015/10/21/chartex" xmlns:cx3="http://schemas.microsoft.com/office/drawing/2016/5/9/chartex" xmlns:cx4="http://schemas.microsoft.com/office/drawing/2016/5/10/chartex" xmlns:cx5="http://schemas.microsoft.com/office/drawing/2016/5/11/chartex" xmlns:cx6="http://schemas.microsoft.com/office/drawing/2016/5/12/chartex" xmlns:cx7="http://schemas.microsoft.com/office/drawing/2016/5/13/chartex" xmlns:cx8="http://schemas.microsoft.com/office/drawing/2016/5/14/chartex" xmlns:mc="http://schemas.openxmlformats.org/markup-compatibility/2006" xmlns:aink="http://schemas.microsoft.com/office/drawing/2016/ink" xmlns:am3d="http://schemas.microsoft.com/office/drawing/2017/model3d" xmlns:o="urn:schemas-microsoft-com:office:office" xmlns:oel="http://schemas.microsoft.com/office/2019/extlst" xmlns:r="http://schemas.openxmlformats.org/officeDocument/2006/relationships" xmlns:m="http://schemas.openxmlformats.org/officeDocument/2006/math" xmlns:v="urn:schemas-microsoft-com:vml" xmlns:wp14="http://schemas.microsoft.com/office/word/2010/wordprocessingDrawing" xmlns:wp="http://schemas.openxmlformats.org/drawingml/2006/wordprocessingDrawing" xmlns:w10="urn:schemas-microsoft-com:office:word" xmlns:w="http://schemas.openxmlformats.org/wordprocessingml/2006/main" xmlns:w14="http://schemas.microsoft.com/office/word/2010/wordml" xmlns:w15="http://schemas.microsoft.com/office/word/2012/wordml" xmlns:w16cex="http://schemas.microsoft.com/office/word/2018/wordml/cex" xmlns:w16cid="http://schemas.microsoft.com/office/word/2016/wordml/cid" xmlns:w16="http://schemas.microsoft.com/office/word/2018/wordml" xmlns:w16du="http://schemas.microsoft.com/office/word/2023/wordml/word16du" xmlns:w16sdtdh="http://schemas.microsoft.com/office/word/2020/wordml/sdtdatahash" xmlns:w16sdtfl="http://schemas.microsoft.com/office/word/2024/wordml/sdtformatlock" xmlns:w16se="http://schemas.microsoft.com/office/word/2015/wordml/symex" xmlns:wpg="http://schemas.microsoft.com/office/word/2010/wordprocessingGroup" xmlns:wpi="http://schemas.microsoft.com/office/word/2010/wordprocessingInk" xmlns:wne="http://schemas.microsoft.com/office/word/2006/wordml" xmlns:wps="http://schemas.microsoft.com/office/word/2010/wordprocessingShape" mc:Ignorable="w14 w15 w16se w16cid w16 w16cex w16sdtdh w16sdtfl w16du wp14">
+<w:numbering xmlns:wpc="http://schemas.microsoft.com/office/word/2010/wordprocessingCanvas" xmlns:cx="http://schemas.microsoft.com/office/drawing/2014/chartex" xmlns:cx1="http://schemas.microsoft.com/office/drawing/2015/9/8/chartex" xmlns:cx2="http://schemas.microsoft.com/office/drawing/2015/10/21/chartex" xmlns:cx3="http://schemas.microsoft.com/office/drawing/2016/5/9/chartex" xmlns:cx4="http://schemas.microsoft.com/office/drawing/2016/5/10/chartex" xmlns:cx5="http://schemas.microsoft.com/office/drawing/2016/5/11/chartex" xmlns:cx6="http://schemas.microsoft.com/office/drawing/2016/5/12/chartex" xmlns:cx7="http://schemas.microsoft.com/office/drawing/2016/5/13/chartex" xmlns:cx8="http://schemas.microsoft.com/office/drawing/2016/5/14/chartex" xmlns:mc="http://schemas.openxmlformats.org/markup-compatibility/2006" xmlns:aink="http://schemas.microsoft.com/office/drawing/2016/ink" xmlns:am3d="http://schemas.microsoft.com/office/drawing/2017/model3d" xmlns:o="urn:schemas-microsoft-com:office:office" xmlns:oel="http://schemas.microsoft.com/office/2019/extlst" xmlns:r="http://schemas.openxmlformats.org/officeDocument/2006/relationships" xmlns:m="http://schemas.openxmlformats.org/officeDocument/2006/math" xmlns:v="urn:schemas-microsoft-com:vml" xmlns:wp14="http://schemas.microsoft.com/office/word/2010/wordprocessingDrawing" xmlns:wp="http://schemas.openxmlformats.org/drawingml/2006/wordprocessingDrawing" xmlns:w10="urn:schemas-microsoft-com:office:word" xmlns:w="http://schemas.openxmlformats.org/wordprocessingml/2006/main" xmlns:w14="http://schemas.microsoft.com/office/word/2010/wordml" xmlns:w15="http://schemas.microsoft.com/office/word/2012/wordml" xmlns:w16cei="http://schemas.microsoft.com/office/word/2026/wordml/cei" xmlns:w16cex="http://schemas.microsoft.com/office/word/2018/wordml/cex" xmlns:w16cid="http://schemas.microsoft.com/office/word/2016/wordml/cid" xmlns:w16="http://schemas.microsoft.com/office/word/2018/wordml" xmlns:w16du="http://schemas.microsoft.com/office/word/2023/wordml/word16du" xmlns:w16sdtdh="http://schemas.microsoft.com/office/word/2020/wordml/sdtdatahash" xmlns:w16sdtfl="http://schemas.microsoft.com/office/word/2024/wordml/sdtformatlock" xmlns:w16se="http://schemas.microsoft.com/office/word/2015/wordml/symex" xmlns:wpg="http://schemas.microsoft.com/office/word/2010/wordprocessingGroup" xmlns:wpi="http://schemas.microsoft.com/office/word/2010/wordprocessingInk" xmlns:wne="http://schemas.microsoft.com/office/word/2006/wordml" xmlns:wps="http://schemas.microsoft.com/office/word/2010/wordprocessingShape" mc:Ignorable="w14 w15 w16se w16cid w16 w16cex w16sdtdh w16sdtfl w16du wp14">
   <w:abstractNum w:abstractNumId="0" w15:restartNumberingAfterBreak="0">
     <w:nsid w:val="05D0368D"/>
     <w:multiLevelType w:val="hybridMultilevel"/>
@@ -1822,6 +1849,7 @@
   <w:style w:type="character" w:default="1" w:styleId="Fuentedeprrafopredeter">
     <w:name w:val="Default Paragraph Font"/>
     <w:uiPriority w:val="1"/>
+    <w:semiHidden/>
     <w:unhideWhenUsed/>
   </w:style>
   <w:style w:type="table" w:default="1" w:styleId="Tablanormal">

</xml_diff>